<commit_message>
Sindhuli deck: signature ice cream on farmstead slide; refresh KO/EN/NE scripts
Co-Authored-By: Claude Opus 5.5 <noreply@anthropic.com>
Claude-Session: https://claude.ai/code/session_01AAhJSJRNm1CGsFjp5LTajX
</commit_message>
<xml_diff>
--- a/deliverables/Sindhuli_Interpreter_Script_EN-KO.docx
+++ b/deliverables/Sindhuli_Interpreter_Script_EN-KO.docx
@@ -1797,7 +1797,7 @@
           <w:i w:val="0"/>
           <w:sz w:val="23"/>
         </w:rPr>
-        <w:t>We use the 'farmstead creamery' method. That means we process milk ourselves, inside the farm. The photo on the left is the processing room inside our farm. Milk from the morning milking is processed the same day, in small amounts, to match orders. We pasteurize it at 75 degrees for only 20 seconds, to keep the natural taste. The middle photo shows our staff in hygiene clothes, putting milk into bottles. At first we sold it by online subscription. Now we also sell it in a top department store in Seoul. On the right is our cafe, 'Hey! Hay Milk', at Anseong Farmland. We make soft ice cream with cream we separate ourselves at the farm, and sell it there. If you sell only raw milk, the price is fixed. But if you process it and sell directly to consumers, the same milk can create much more value. Here is the lesson I want to give you. A small farm cannot beat a big company on volume. Instead, you must be different in breed, feed, freshness and story. And you must go closer to the consumer to sell. Sindhuli milk can also have its own Sindhuli story.</w:t>
+        <w:t>We use the 'farmstead creamery' method. That means we process milk ourselves, inside the farm. The photo on the left is the processing room inside our farm. Milk from the morning milking is processed the same day, in small amounts, to match orders. We pasteurize it at 75 degrees for only 20 seconds, to keep the natural taste. The middle photo shows our staff in hygiene clothes, putting milk into bottles. At first we sold it by online subscription. Now we also sell it in a top department store in Seoul. On the right is our cafe, 'Hey! Hay Milk', at Anseong Farmland. On the far right is our signature menu: soft ice cream made with 100% A2 Jersey milk. We make soft ice cream with cream we separate ourselves at the farm, and sell it there. If you sell only raw milk, the price is fixed. But if you process it and sell directly to consumers, the same milk can create much more value. Here is the lesson I want to give you. A small farm cannot beat a big company on volume. Instead, you must be different in breed, feed, freshness and story. And you must go closer to the consumer to sell. Sindhuli milk can also have its own Sindhuli story.</w:t>
       </w:r>
     </w:p>
     <w:p>
@@ -1812,7 +1812,7 @@
           <w:color w:val="5A5A5A"/>
           <w:sz w:val="19"/>
         </w:rPr>
-        <w:t>저희는 '팜스테드 크리머리', 즉 목장 안에서 직접 가공하는 방식을 씁니다. 왼쪽 사진이 저희 목장 안에 있는 가공장입니다. 아침에 짠 우유를 그날 바로, 주문량에 맞춰 조금씩 가공합니다. 75도에서 20초만 살균해서 원래 맛을 살립니다. 가운데 사진은 저희 직원들이 위생복을 입고 우유를 병에 담는 모습입니다. 처음에는 온라인 정기구독으로 팔았고, 지금은 서울의 최고급 백화점에서도 팝니다. 오른쪽은 안성팜랜드에 있는 저희 카페 '헤이! 헤이밀크'입니다. 목장에서 직접 분리한 크림으로 소프트아이스크림을 만들어 팝니다. 우유를 원유로만 팔면 값이 정해져 있지만, 가공하고 소비자에게 직접 팔면 같은 우유로 훨씬 많은 가치를 만들 수 있습니다. 여기서 드리고 싶은 교훈은 이것입니다. 작은 목장은 양으로는 큰 회사를 이길 수 없습니다. 대신 품종, 사료, 신선함, 그리고 이야기로 다르게 만들고, 소비자에게 더 가까이 가서 팔아야 합니다. 신둘리 우유도 신둘리만의 이야기를 가질 수 있습니다.</w:t>
+        <w:t>저희는 '팜스테드 크리머리', 즉 목장 안에서 직접 가공하는 방식을 씁니다. 왼쪽 사진이 저희 목장 안에 있는 가공장입니다. 아침에 짠 우유를 그날 바로, 주문량에 맞춰 조금씩 가공합니다. 75도에서 20초만 살균해서 원래 맛을 살립니다. 가운데 사진은 저희 직원들이 위생복을 입고 우유를 병에 담는 모습입니다. 처음에는 온라인 정기구독으로 팔았고, 지금은 서울의 최고급 백화점에서도 팝니다. 오른쪽은 안성팜랜드에 있는 저희 카페 '헤이! 헤이밀크'이고, 맨 오른쪽이 저희 시그니처 메뉴, 100% A2 저지 우유로 만든 소프트아이스크림입니다. 목장에서 직접 분리한 크림으로 소프트아이스크림을 만들어 팝니다. 우유를 원유로만 팔면 값이 정해져 있지만, 가공하고 소비자에게 직접 팔면 같은 우유로 훨씬 많은 가치를 만들 수 있습니다. 여기서 드리고 싶은 교훈은 이것입니다. 작은 목장은 양으로는 큰 회사를 이길 수 없습니다. 대신 품종, 사료, 신선함, 그리고 이야기로 다르게 만들고, 소비자에게 더 가까이 가서 팔아야 합니다. 신둘리 우유도 신둘리만의 이야기를 가질 수 있습니다.</w:t>
       </w:r>
     </w:p>
     <w:p>

</xml_diff>